<commit_message>
Hide showcase and AI content for literary agent querying
Remove Showcase and Website Refresh from nav, homepage, and sitemap.
Strip AI engineering language from metadata, manifesto, and taglines.
Add noindex to showcase and website-preview pages. Disallow in robots.txt.
Lane 03 replaced with Personal Myth Authoring.

Co-Authored-By: Claude Sonnet 4.6 <noreply@anthropic.com>
</commit_message>
<xml_diff>
--- a/public/journal/chapter-01-pollex-audit.docx
+++ b/public/journal/chapter-01-pollex-audit.docx
@@ -7,9 +7,11 @@
         <w:pStyle w:val="ChapterHeading"/>
       </w:pPr>
       <w:r>
-        <w:t>CHAPTER ONE | IT BEGAN WITH A RUMBLE</w:t>
-      </w:r>
-      <w:r/>
+        <w:t xml:space="preserve">CHAPTER ONE | </w:t>
+      </w:r>
+      <w:r>
+        <w:t>IT BEGAN WITH A RUMBLE</w:t>
+      </w:r>
     </w:p>
     <w:p>
       <w:pPr>
@@ -37,7 +39,7 @@
         <w:t xml:space="preserve"> </w:t>
       </w:r>
       <w:r>
-        <w:t>the noise</w:t>
+        <w:t>the disturbance</w:t>
       </w:r>
       <w:r>
         <w:t xml:space="preserve"> his stomach, he ignored the sound until it grew and deepened into a tearing above. A giant hole peeled open over his tiny island.</w:t>

</xml_diff>